<commit_message>
docs: document first physical validation (v0.1.0)
</commit_message>
<xml_diff>
--- a/docs/Diario de bordo - Simei.docx
+++ b/docs/Diario de bordo - Simei.docx
@@ -9,8 +9,6 @@
           <w:rFonts w:ascii="Arial" w:hAnsi="Arial" w:cs="Arial"/>
           <w:b/>
           <w:bCs/>
-          <w:sz w:val="20"/>
-          <w:szCs w:val="20"/>
         </w:rPr>
       </w:pPr>
       <w:r>
@@ -18,8 +16,6 @@
           <w:rFonts w:ascii="Arial" w:hAnsi="Arial" w:cs="Arial"/>
           <w:b/>
           <w:bCs/>
-          <w:sz w:val="20"/>
-          <w:szCs w:val="20"/>
         </w:rPr>
         <w:t>DIÁRIO DE BORDO – SIMEI</w:t>
       </w:r>
@@ -97,8 +93,6 @@
           <w:rFonts w:ascii="Arial" w:hAnsi="Arial" w:cs="Arial"/>
           <w:b/>
           <w:bCs/>
-          <w:sz w:val="20"/>
-          <w:szCs w:val="20"/>
         </w:rPr>
       </w:pPr>
       <w:r>
@@ -106,8 +100,6 @@
           <w:rFonts w:ascii="Arial" w:hAnsi="Arial" w:cs="Arial"/>
           <w:b/>
           <w:bCs/>
-          <w:sz w:val="20"/>
-          <w:szCs w:val="20"/>
         </w:rPr>
         <w:t>21 DE JULHO DE 2026</w:t>
       </w:r>
@@ -296,8 +288,6 @@
           <w:rFonts w:ascii="Arial" w:hAnsi="Arial" w:cs="Arial"/>
           <w:b/>
           <w:bCs/>
-          <w:sz w:val="20"/>
-          <w:szCs w:val="20"/>
         </w:rPr>
       </w:pPr>
       <w:r>
@@ -305,8 +295,6 @@
           <w:rFonts w:ascii="Arial" w:hAnsi="Arial" w:cs="Arial"/>
           <w:b/>
           <w:bCs/>
-          <w:sz w:val="20"/>
-          <w:szCs w:val="20"/>
         </w:rPr>
         <w:t>22 DE JULHO DE 2026</w:t>
       </w:r>
@@ -668,6 +656,7 @@
           <w:sz w:val="20"/>
           <w:szCs w:val="20"/>
         </w:rPr>
+        <w:lastRenderedPageBreak/>
         <w:t xml:space="preserve">Utilizar </w:t>
       </w:r>
       <w:r>
@@ -708,7 +697,6 @@
           <w:sz w:val="20"/>
           <w:szCs w:val="20"/>
         </w:rPr>
-        <w:lastRenderedPageBreak/>
         <w:t xml:space="preserve">Desenvolver uma </w:t>
       </w:r>
       <w:r>
@@ -1063,6 +1051,187 @@
           <w:szCs w:val="20"/>
         </w:rPr>
       </w:pPr>
+    </w:p>
+    <w:p>
+      <w:pPr>
+        <w:jc w:val="both"/>
+        <w:rPr>
+          <w:rFonts w:ascii="Arial" w:hAnsi="Arial" w:cs="Arial"/>
+          <w:b/>
+          <w:bCs/>
+        </w:rPr>
+      </w:pPr>
+      <w:r>
+        <w:rPr>
+          <w:rFonts w:ascii="Arial" w:hAnsi="Arial" w:cs="Arial"/>
+          <w:b/>
+          <w:bCs/>
+        </w:rPr>
+        <w:t xml:space="preserve">23 DE JULHO DE 2026 </w:t>
+      </w:r>
+    </w:p>
+    <w:p>
+      <w:pPr>
+        <w:jc w:val="both"/>
+        <w:rPr>
+          <w:rFonts w:ascii="Arial" w:hAnsi="Arial" w:cs="Arial"/>
+          <w:sz w:val="20"/>
+          <w:szCs w:val="20"/>
+        </w:rPr>
+      </w:pPr>
+      <w:r>
+        <w:rPr>
+          <w:rFonts w:ascii="Arial" w:hAnsi="Arial" w:cs="Arial"/>
+          <w:sz w:val="20"/>
+          <w:szCs w:val="20"/>
+        </w:rPr>
+        <w:t>Validação física do protótipo SIMEI v0.1.0</w:t>
+      </w:r>
+    </w:p>
+    <w:p>
+      <w:pPr>
+        <w:jc w:val="both"/>
+        <w:rPr>
+          <w:rFonts w:ascii="Arial" w:hAnsi="Arial" w:cs="Arial"/>
+          <w:sz w:val="20"/>
+          <w:szCs w:val="20"/>
+        </w:rPr>
+      </w:pPr>
+      <w:r>
+        <w:rPr>
+          <w:rFonts w:ascii="Arial" w:hAnsi="Arial" w:cs="Arial"/>
+          <w:sz w:val="20"/>
+          <w:szCs w:val="20"/>
+        </w:rPr>
+        <w:t xml:space="preserve">No terceiro dia de desenvolvimento foi realizada a montagem da primeira bancada física do projeto utilizando um Arduino Uno, LEDs para representação dos dispositivos operacionais, </w:t>
+      </w:r>
+      <w:proofErr w:type="spellStart"/>
+      <w:r>
+        <w:rPr>
+          <w:rFonts w:ascii="Arial" w:hAnsi="Arial" w:cs="Arial"/>
+          <w:sz w:val="20"/>
+          <w:szCs w:val="20"/>
+        </w:rPr>
+        <w:t>buzzer</w:t>
+      </w:r>
+      <w:proofErr w:type="spellEnd"/>
+      <w:r>
+        <w:rPr>
+          <w:rFonts w:ascii="Arial" w:hAnsi="Arial" w:cs="Arial"/>
+          <w:sz w:val="20"/>
+          <w:szCs w:val="20"/>
+        </w:rPr>
+        <w:t xml:space="preserve"> para sinalização sonora e protoboard.</w:t>
+      </w:r>
+    </w:p>
+    <w:p>
+      <w:pPr>
+        <w:jc w:val="both"/>
+        <w:rPr>
+          <w:rFonts w:ascii="Arial" w:hAnsi="Arial" w:cs="Arial"/>
+          <w:sz w:val="20"/>
+          <w:szCs w:val="20"/>
+        </w:rPr>
+      </w:pPr>
+      <w:r>
+        <w:rPr>
+          <w:rFonts w:ascii="Arial" w:hAnsi="Arial" w:cs="Arial"/>
+          <w:sz w:val="20"/>
+          <w:szCs w:val="20"/>
+        </w:rPr>
+        <w:t xml:space="preserve">Inicialmente foram realizados testes individuais dos componentes eletrônicos (LEDs, resistores e </w:t>
+      </w:r>
+      <w:proofErr w:type="spellStart"/>
+      <w:r>
+        <w:rPr>
+          <w:rFonts w:ascii="Arial" w:hAnsi="Arial" w:cs="Arial"/>
+          <w:sz w:val="20"/>
+          <w:szCs w:val="20"/>
+        </w:rPr>
+        <w:t>buzzer</w:t>
+      </w:r>
+      <w:proofErr w:type="spellEnd"/>
+      <w:r>
+        <w:rPr>
+          <w:rFonts w:ascii="Arial" w:hAnsi="Arial" w:cs="Arial"/>
+          <w:sz w:val="20"/>
+          <w:szCs w:val="20"/>
+        </w:rPr>
+        <w:t>), confirmando o funcionamento adequado da bancada antes da integração com o firmware desenvolvido.</w:t>
+      </w:r>
+    </w:p>
+    <w:p>
+      <w:pPr>
+        <w:jc w:val="both"/>
+        <w:rPr>
+          <w:rFonts w:ascii="Arial" w:hAnsi="Arial" w:cs="Arial"/>
+          <w:sz w:val="20"/>
+          <w:szCs w:val="20"/>
+        </w:rPr>
+      </w:pPr>
+      <w:r>
+        <w:rPr>
+          <w:rFonts w:ascii="Arial" w:hAnsi="Arial" w:cs="Arial"/>
+          <w:sz w:val="20"/>
+          <w:szCs w:val="20"/>
+        </w:rPr>
+        <w:t>Após a montagem completa do circuito, foi executada a primeira validação física do sistema, onde a lógica de intertravamentos, a sequência operacional e os modos de operação (Guiado e Avaliação) responderam corretamente aos comandos enviados pelo operador através do Monitor Serial da IDE do Arduino.</w:t>
+      </w:r>
+    </w:p>
+    <w:p>
+      <w:pPr>
+        <w:jc w:val="both"/>
+        <w:rPr>
+          <w:rFonts w:ascii="Arial" w:hAnsi="Arial" w:cs="Arial"/>
+          <w:sz w:val="20"/>
+          <w:szCs w:val="20"/>
+        </w:rPr>
+      </w:pPr>
+      <w:r>
+        <w:rPr>
+          <w:rFonts w:ascii="Arial" w:hAnsi="Arial" w:cs="Arial"/>
+          <w:sz w:val="20"/>
+          <w:szCs w:val="20"/>
+        </w:rPr>
+        <w:t>Durante os testes também foi realizada a organização estrutural do projeto, incluindo a atualização do repositório no GitHub, revisão da documentação técnica, reorganização da estrutura de diretórios e publicação da primeira demonstração do protótipo no LinkedIn.</w:t>
+      </w:r>
+    </w:p>
+    <w:p>
+      <w:pPr>
+        <w:jc w:val="both"/>
+        <w:rPr>
+          <w:rFonts w:ascii="Arial" w:hAnsi="Arial" w:cs="Arial"/>
+          <w:sz w:val="20"/>
+          <w:szCs w:val="20"/>
+        </w:rPr>
+      </w:pPr>
+      <w:r>
+        <w:rPr>
+          <w:rFonts w:ascii="Arial" w:hAnsi="Arial" w:cs="Arial"/>
+          <w:sz w:val="20"/>
+          <w:szCs w:val="20"/>
+        </w:rPr>
+        <w:t>Como resultado desta etapa, foi obtida a primeira validação prática do conceito proposto pelo SIMEI, demonstrando que a arquitetura inicial do sistema é capaz de reproduzir sequências operacionais de forma consistente em ambiente controlado.</w:t>
+      </w:r>
+    </w:p>
+    <w:p>
+      <w:pPr>
+        <w:jc w:val="both"/>
+        <w:rPr>
+          <w:rFonts w:ascii="Arial" w:hAnsi="Arial" w:cs="Arial"/>
+          <w:sz w:val="20"/>
+          <w:szCs w:val="20"/>
+        </w:rPr>
+      </w:pPr>
+      <w:r>
+        <w:rPr>
+          <w:rFonts w:ascii="Arial" w:hAnsi="Arial" w:cs="Arial"/>
+          <w:sz w:val="20"/>
+          <w:szCs w:val="20"/>
+        </w:rPr>
+        <w:lastRenderedPageBreak/>
+        <w:t>Por fim, foi definido o planejamento para a próxima etapa do projeto, que contemplará o desenvolvimento da Interface Homem-Máquina (IHM), bem como a implementação de novas funcionalidades voltadas à simulação de balanceamento entre transformadores, incluindo verificação de posição de TAP, tensão e corrente antes da execução das manobras.</w:t>
+      </w:r>
     </w:p>
     <w:sectPr>
       <w:pgSz w:w="11906" w:h="16838"/>
@@ -2406,6 +2575,7 @@
   <w:style w:type="character" w:default="1" w:styleId="Fontepargpadro">
     <w:name w:val="Default Paragraph Font"/>
     <w:uiPriority w:val="1"/>
+    <w:semiHidden/>
     <w:unhideWhenUsed/>
   </w:style>
   <w:style w:type="table" w:default="1" w:styleId="Tabelanormal">

</xml_diff>